<commit_message>
Update file docx and sql
</commit_message>
<xml_diff>
--- a/LY_THUYET/BUOI9/b9_1250080208_DoTienTri_12_DH_CNTT4.docx
+++ b/LY_THUYET/BUOI9/b9_1250080208_DoTienTri_12_DH_CNTT4.docx
@@ -63,93 +63,71 @@
       <w:pPr>
         <w:jc w:val="center"/>
         <w:rPr>
+          <w:rFonts w:hint="default"/>
+          <w:lang w:val="vi-VN"/>
+        </w:rPr>
+      </w:pPr>
+      <w:r>
+        <w:rPr>
           <w:rFonts w:hint="default" w:ascii="Times New Roman" w:hAnsi="Times New Roman" w:cs="Times New Roman"/>
           <w:sz w:val="28"/>
           <w:szCs w:val="28"/>
-          <w:lang w:val="en-US"/>
-        </w:rPr>
-      </w:pPr>
-      <w:r>
-        <w:rPr>
-          <w:rFonts w:hint="default" w:ascii="Times New Roman" w:hAnsi="Times New Roman" w:cs="Times New Roman"/>
-          <w:sz w:val="28"/>
-          <w:szCs w:val="28"/>
-          <w:lang w:val="vi-VN"/>
-        </w:rPr>
-        <w:t xml:space="preserve">Báo Cáo Bài Tập Tuần </w:t>
-      </w:r>
-      <w:r>
-        <w:rPr>
-          <w:rFonts w:hint="default" w:ascii="Times New Roman" w:hAnsi="Times New Roman" w:cs="Times New Roman"/>
-          <w:sz w:val="28"/>
-          <w:szCs w:val="28"/>
-          <w:lang w:val="en-US"/>
-        </w:rPr>
-        <w:t>8</w:t>
-      </w:r>
-    </w:p>
-    <w:p>
-      <w:pPr>
-        <w:numPr>
-          <w:ilvl w:val="0"/>
-          <w:numId w:val="0"/>
-        </w:numPr>
-        <w:rPr>
-          <w:rFonts w:hint="default"/>
-          <w:lang w:val="vi-VN"/>
-        </w:rPr>
-      </w:pPr>
-      <w:r>
-        <w:rPr>
-          <w:rFonts w:hint="default"/>
-          <w:lang w:val="vi-VN"/>
-        </w:rPr>
-        <w:t xml:space="preserve">Bài tập 1 </w:t>
-      </w:r>
-    </w:p>
-    <w:p>
-      <w:pPr>
-        <w:numPr>
-          <w:ilvl w:val="0"/>
-          <w:numId w:val="0"/>
-        </w:numPr>
-        <w:rPr>
-          <w:rFonts w:hint="default"/>
-          <w:lang w:val="vi-VN"/>
-        </w:rPr>
-      </w:pPr>
-      <w:r>
-        <w:rPr>
-          <w:rFonts w:hint="default"/>
-          <w:lang w:val="vi-VN"/>
-        </w:rPr>
-        <w:t>a/</w:t>
-      </w:r>
-    </w:p>
-    <w:p>
-      <w:pPr>
-        <w:numPr>
-          <w:ilvl w:val="0"/>
-          <w:numId w:val="0"/>
-        </w:numPr>
-        <w:rPr>
-          <w:rFonts w:hint="default"/>
-          <w:lang w:val="vi-VN"/>
-        </w:rPr>
-      </w:pPr>
-      <w:r>
-        <w:rPr>
-          <w:rFonts w:hint="default"/>
-          <w:lang w:val="vi-VN"/>
-        </w:rPr>
-        <w:t xml:space="preserve"> </w:t>
-      </w:r>
+          <w:lang w:val="vi-VN"/>
+        </w:rPr>
+        <w:t>Báo Cáo Bài Tập Tuần 9</w:t>
+      </w:r>
+    </w:p>
+    <w:p>
+      <w:pPr>
+        <w:numPr>
+          <w:ilvl w:val="0"/>
+          <w:numId w:val="0"/>
+        </w:numPr>
+        <w:rPr>
+          <w:rFonts w:hint="default"/>
+          <w:lang w:val="vi-VN"/>
+        </w:rPr>
+      </w:pPr>
+      <w:r>
+        <w:rPr>
+          <w:rFonts w:hint="default"/>
+          <w:lang w:val="vi-VN"/>
+        </w:rPr>
+        <w:t>Phiếu 1</w:t>
+      </w:r>
+    </w:p>
+    <w:p>
+      <w:pPr>
+        <w:numPr>
+          <w:ilvl w:val="0"/>
+          <w:numId w:val="0"/>
+        </w:numPr>
+        <w:rPr>
+          <w:rFonts w:hint="default"/>
+          <w:lang w:val="vi-VN"/>
+        </w:rPr>
+      </w:pPr>
+      <w:r>
+        <w:rPr>
+          <w:rFonts w:hint="default"/>
+          <w:lang w:val="vi-VN"/>
+        </w:rPr>
+        <w:t>Bài 1</w:t>
+      </w:r>
+    </w:p>
+    <w:p>
+      <w:pPr>
+        <w:numPr>
+          <w:ilvl w:val="0"/>
+          <w:numId w:val="0"/>
+        </w:numPr>
+      </w:pPr>
       <w:r>
         <w:drawing>
           <wp:inline distT="0" distB="0" distL="114300" distR="114300">
-            <wp:extent cx="4460875" cy="2415540"/>
-            <wp:effectExtent l="0" t="0" r="15875" b="3810"/>
-            <wp:docPr id="1" name="Picture 1"/>
+            <wp:extent cx="5270500" cy="4682490"/>
+            <wp:effectExtent l="0" t="0" r="6350" b="3810"/>
+            <wp:docPr id="16" name="Picture 1"/>
             <wp:cNvGraphicFramePr>
               <a:graphicFrameLocks xmlns:a="http://schemas.openxmlformats.org/drawingml/2006/main" noChangeAspect="1"/>
             </wp:cNvGraphicFramePr>
@@ -157,7 +135,7 @@
               <a:graphicData uri="http://schemas.openxmlformats.org/drawingml/2006/picture">
                 <pic:pic xmlns:pic="http://schemas.openxmlformats.org/drawingml/2006/picture">
                   <pic:nvPicPr>
-                    <pic:cNvPr id="1" name="Picture 1"/>
+                    <pic:cNvPr id="16" name="Picture 1"/>
                     <pic:cNvPicPr>
                       <a:picLocks noChangeAspect="1"/>
                     </pic:cNvPicPr>
@@ -171,7 +149,7 @@
                   <pic:spPr>
                     <a:xfrm>
                       <a:off x="0" y="0"/>
-                      <a:ext cx="4460875" cy="2415540"/>
+                      <a:ext cx="5270500" cy="4682490"/>
                     </a:xfrm>
                     <a:prstGeom prst="rect">
                       <a:avLst/>
@@ -204,7 +182,7 @@
           <w:rFonts w:hint="default"/>
           <w:lang w:val="vi-VN"/>
         </w:rPr>
-        <w:t>b/</w:t>
+        <w:t xml:space="preserve">Bài 2 </w:t>
       </w:r>
     </w:p>
     <w:p>
@@ -221,9 +199,9 @@
       <w:r>
         <w:drawing>
           <wp:inline distT="0" distB="0" distL="114300" distR="114300">
-            <wp:extent cx="5270500" cy="4137025"/>
-            <wp:effectExtent l="0" t="0" r="6350" b="15875"/>
-            <wp:docPr id="2" name="Picture 2"/>
+            <wp:extent cx="5270500" cy="1238885"/>
+            <wp:effectExtent l="0" t="0" r="6350" b="18415"/>
+            <wp:docPr id="17" name="Picture 2"/>
             <wp:cNvGraphicFramePr>
               <a:graphicFrameLocks xmlns:a="http://schemas.openxmlformats.org/drawingml/2006/main" noChangeAspect="1"/>
             </wp:cNvGraphicFramePr>
@@ -231,7 +209,7 @@
               <a:graphicData uri="http://schemas.openxmlformats.org/drawingml/2006/picture">
                 <pic:pic xmlns:pic="http://schemas.openxmlformats.org/drawingml/2006/picture">
                   <pic:nvPicPr>
-                    <pic:cNvPr id="2" name="Picture 2"/>
+                    <pic:cNvPr id="17" name="Picture 2"/>
                     <pic:cNvPicPr>
                       <a:picLocks noChangeAspect="1"/>
                     </pic:cNvPicPr>
@@ -245,7 +223,7 @@
                   <pic:spPr>
                     <a:xfrm>
                       <a:off x="0" y="0"/>
-                      <a:ext cx="5270500" cy="4137025"/>
+                      <a:ext cx="5270500" cy="1238885"/>
                     </a:xfrm>
                     <a:prstGeom prst="rect">
                       <a:avLst/>
@@ -261,43 +239,12 @@
           </wp:inline>
         </w:drawing>
       </w:r>
-    </w:p>
-    <w:p>
-      <w:pPr>
-        <w:numPr>
-          <w:ilvl w:val="0"/>
-          <w:numId w:val="0"/>
-        </w:numPr>
-        <w:rPr>
-          <w:rFonts w:hint="default"/>
-          <w:lang w:val="vi-VN"/>
-        </w:rPr>
-      </w:pPr>
-      <w:r>
-        <w:rPr>
-          <w:rFonts w:hint="default"/>
-          <w:lang w:val="vi-VN"/>
-        </w:rPr>
-        <w:t>C/</w:t>
-      </w:r>
-    </w:p>
-    <w:p>
-      <w:pPr>
-        <w:numPr>
-          <w:ilvl w:val="0"/>
-          <w:numId w:val="0"/>
-        </w:numPr>
-        <w:rPr>
-          <w:rFonts w:hint="default"/>
-          <w:lang w:val="vi-VN"/>
-        </w:rPr>
-      </w:pPr>
       <w:r>
         <w:drawing>
           <wp:inline distT="0" distB="0" distL="114300" distR="114300">
-            <wp:extent cx="5269865" cy="3318510"/>
-            <wp:effectExtent l="0" t="0" r="6985" b="15240"/>
-            <wp:docPr id="3" name="Picture 3"/>
+            <wp:extent cx="5268595" cy="947420"/>
+            <wp:effectExtent l="0" t="0" r="8255" b="5080"/>
+            <wp:docPr id="18" name="Picture 3"/>
             <wp:cNvGraphicFramePr>
               <a:graphicFrameLocks xmlns:a="http://schemas.openxmlformats.org/drawingml/2006/main" noChangeAspect="1"/>
             </wp:cNvGraphicFramePr>
@@ -305,7 +252,7 @@
               <a:graphicData uri="http://schemas.openxmlformats.org/drawingml/2006/picture">
                 <pic:pic xmlns:pic="http://schemas.openxmlformats.org/drawingml/2006/picture">
                   <pic:nvPicPr>
-                    <pic:cNvPr id="3" name="Picture 3"/>
+                    <pic:cNvPr id="18" name="Picture 3"/>
                     <pic:cNvPicPr>
                       <a:picLocks noChangeAspect="1"/>
                     </pic:cNvPicPr>
@@ -319,7 +266,7 @@
                   <pic:spPr>
                     <a:xfrm>
                       <a:off x="0" y="0"/>
-                      <a:ext cx="5269865" cy="3318510"/>
+                      <a:ext cx="5268595" cy="947420"/>
                     </a:xfrm>
                     <a:prstGeom prst="rect">
                       <a:avLst/>
@@ -342,17 +289,25 @@
           <w:ilvl w:val="0"/>
           <w:numId w:val="0"/>
         </w:numPr>
-        <w:rPr>
-          <w:rFonts w:hint="default"/>
-          <w:lang w:val="vi-VN"/>
-        </w:rPr>
-      </w:pPr>
-      <w:r>
-        <w:rPr>
-          <w:rFonts w:hint="default"/>
-          <w:lang w:val="vi-VN"/>
-        </w:rPr>
-        <w:t>D/</w:t>
+      </w:pPr>
+    </w:p>
+    <w:p>
+      <w:pPr>
+        <w:numPr>
+          <w:ilvl w:val="0"/>
+          <w:numId w:val="0"/>
+        </w:numPr>
+        <w:rPr>
+          <w:rFonts w:hint="default"/>
+          <w:lang w:val="vi-VN"/>
+        </w:rPr>
+      </w:pPr>
+      <w:r>
+        <w:rPr>
+          <w:rFonts w:hint="default"/>
+          <w:lang w:val="vi-VN"/>
+        </w:rPr>
+        <w:t xml:space="preserve">Bài 3 </w:t>
       </w:r>
     </w:p>
     <w:p>
@@ -369,9 +324,9 @@
       <w:r>
         <w:drawing>
           <wp:inline distT="0" distB="0" distL="114300" distR="114300">
-            <wp:extent cx="5269230" cy="3241040"/>
-            <wp:effectExtent l="0" t="0" r="7620" b="16510"/>
-            <wp:docPr id="4" name="Picture 4"/>
+            <wp:extent cx="5268595" cy="1659255"/>
+            <wp:effectExtent l="0" t="0" r="8255" b="17145"/>
+            <wp:docPr id="19" name="Picture 4"/>
             <wp:cNvGraphicFramePr>
               <a:graphicFrameLocks xmlns:a="http://schemas.openxmlformats.org/drawingml/2006/main" noChangeAspect="1"/>
             </wp:cNvGraphicFramePr>
@@ -379,7 +334,7 @@
               <a:graphicData uri="http://schemas.openxmlformats.org/drawingml/2006/picture">
                 <pic:pic xmlns:pic="http://schemas.openxmlformats.org/drawingml/2006/picture">
                   <pic:nvPicPr>
-                    <pic:cNvPr id="4" name="Picture 4"/>
+                    <pic:cNvPr id="19" name="Picture 4"/>
                     <pic:cNvPicPr>
                       <a:picLocks noChangeAspect="1"/>
                     </pic:cNvPicPr>
@@ -393,7 +348,7 @@
                   <pic:spPr>
                     <a:xfrm>
                       <a:off x="0" y="0"/>
-                      <a:ext cx="5269230" cy="3241040"/>
+                      <a:ext cx="5268595" cy="1659255"/>
                     </a:xfrm>
                     <a:prstGeom prst="rect">
                       <a:avLst/>
@@ -409,31 +364,12 @@
           </wp:inline>
         </w:drawing>
       </w:r>
-    </w:p>
-    <w:p>
-      <w:pPr>
-        <w:numPr>
-          <w:ilvl w:val="0"/>
-          <w:numId w:val="0"/>
-        </w:numPr>
-        <w:rPr>
-          <w:rFonts w:hint="default"/>
-          <w:lang w:val="vi-VN"/>
-        </w:rPr>
-      </w:pPr>
-      <w:r>
-        <w:rPr>
-          <w:rFonts w:hint="default"/>
-          <w:lang w:val="vi-VN"/>
-        </w:rPr>
-        <w:t>E/</w:t>
-      </w:r>
       <w:r>
         <w:drawing>
           <wp:inline distT="0" distB="0" distL="114300" distR="114300">
-            <wp:extent cx="5265420" cy="3236595"/>
-            <wp:effectExtent l="0" t="0" r="11430" b="1905"/>
-            <wp:docPr id="5" name="Picture 5"/>
+            <wp:extent cx="5271135" cy="852805"/>
+            <wp:effectExtent l="0" t="0" r="5715" b="4445"/>
+            <wp:docPr id="20" name="Picture 5"/>
             <wp:cNvGraphicFramePr>
               <a:graphicFrameLocks xmlns:a="http://schemas.openxmlformats.org/drawingml/2006/main" noChangeAspect="1"/>
             </wp:cNvGraphicFramePr>
@@ -441,7 +377,7 @@
               <a:graphicData uri="http://schemas.openxmlformats.org/drawingml/2006/picture">
                 <pic:pic xmlns:pic="http://schemas.openxmlformats.org/drawingml/2006/picture">
                   <pic:nvPicPr>
-                    <pic:cNvPr id="5" name="Picture 5"/>
+                    <pic:cNvPr id="20" name="Picture 5"/>
                     <pic:cNvPicPr>
                       <a:picLocks noChangeAspect="1"/>
                     </pic:cNvPicPr>
@@ -455,7 +391,7 @@
                   <pic:spPr>
                     <a:xfrm>
                       <a:off x="0" y="0"/>
-                      <a:ext cx="5265420" cy="3236595"/>
+                      <a:ext cx="5271135" cy="852805"/>
                     </a:xfrm>
                     <a:prstGeom prst="rect">
                       <a:avLst/>
@@ -478,17 +414,44 @@
           <w:ilvl w:val="0"/>
           <w:numId w:val="0"/>
         </w:numPr>
-        <w:rPr>
-          <w:rFonts w:hint="default"/>
-          <w:lang w:val="vi-VN"/>
-        </w:rPr>
-      </w:pPr>
-      <w:r>
-        <w:rPr>
-          <w:rFonts w:hint="default"/>
-          <w:lang w:val="vi-VN"/>
-        </w:rPr>
-        <w:t>F/</w:t>
+      </w:pPr>
+    </w:p>
+    <w:p>
+      <w:pPr>
+        <w:numPr>
+          <w:ilvl w:val="0"/>
+          <w:numId w:val="0"/>
+        </w:numPr>
+        <w:rPr>
+          <w:rFonts w:hint="default"/>
+          <w:lang w:val="vi-VN"/>
+        </w:rPr>
+      </w:pPr>
+      <w:r>
+        <w:rPr>
+          <w:rFonts w:hint="default"/>
+          <w:lang w:val="vi-VN"/>
+        </w:rPr>
+        <w:t>Phiếu 2</w:t>
+      </w:r>
+    </w:p>
+    <w:p>
+      <w:pPr>
+        <w:numPr>
+          <w:ilvl w:val="0"/>
+          <w:numId w:val="0"/>
+        </w:numPr>
+        <w:rPr>
+          <w:rFonts w:hint="default"/>
+          <w:lang w:val="vi-VN"/>
+        </w:rPr>
+      </w:pPr>
+      <w:r>
+        <w:rPr>
+          <w:rFonts w:hint="default"/>
+          <w:lang w:val="vi-VN"/>
+        </w:rPr>
+        <w:t>a/</w:t>
       </w:r>
     </w:p>
     <w:p>
@@ -505,9 +468,9 @@
       <w:r>
         <w:drawing>
           <wp:inline distT="0" distB="0" distL="114300" distR="114300">
-            <wp:extent cx="5270500" cy="2936875"/>
-            <wp:effectExtent l="0" t="0" r="6350" b="15875"/>
-            <wp:docPr id="6" name="Picture 6"/>
+            <wp:extent cx="5266690" cy="877570"/>
+            <wp:effectExtent l="0" t="0" r="10160" b="17780"/>
+            <wp:docPr id="21" name="Picture 6"/>
             <wp:cNvGraphicFramePr>
               <a:graphicFrameLocks xmlns:a="http://schemas.openxmlformats.org/drawingml/2006/main" noChangeAspect="1"/>
             </wp:cNvGraphicFramePr>
@@ -515,7 +478,7 @@
               <a:graphicData uri="http://schemas.openxmlformats.org/drawingml/2006/picture">
                 <pic:pic xmlns:pic="http://schemas.openxmlformats.org/drawingml/2006/picture">
                   <pic:nvPicPr>
-                    <pic:cNvPr id="6" name="Picture 6"/>
+                    <pic:cNvPr id="21" name="Picture 6"/>
                     <pic:cNvPicPr>
                       <a:picLocks noChangeAspect="1"/>
                     </pic:cNvPicPr>
@@ -529,7 +492,7 @@
                   <pic:spPr>
                     <a:xfrm>
                       <a:off x="0" y="0"/>
-                      <a:ext cx="5270500" cy="2936875"/>
+                      <a:ext cx="5266690" cy="877570"/>
                     </a:xfrm>
                     <a:prstGeom prst="rect">
                       <a:avLst/>
@@ -562,22 +525,26 @@
           <w:rFonts w:hint="default"/>
           <w:lang w:val="vi-VN"/>
         </w:rPr>
-        <w:t>G/</w:t>
-      </w:r>
-    </w:p>
-    <w:p>
-      <w:pPr>
-        <w:numPr>
-          <w:ilvl w:val="0"/>
-          <w:numId w:val="0"/>
-        </w:numPr>
+        <w:t>B/</w:t>
+      </w:r>
+    </w:p>
+    <w:p>
+      <w:pPr>
+        <w:numPr>
+          <w:ilvl w:val="0"/>
+          <w:numId w:val="0"/>
+        </w:numPr>
+        <w:rPr>
+          <w:rFonts w:hint="default"/>
+          <w:lang w:val="vi-VN"/>
+        </w:rPr>
       </w:pPr>
       <w:r>
         <w:drawing>
           <wp:inline distT="0" distB="0" distL="114300" distR="114300">
-            <wp:extent cx="5262880" cy="3072130"/>
-            <wp:effectExtent l="0" t="0" r="13970" b="13970"/>
-            <wp:docPr id="7" name="Picture 7"/>
+            <wp:extent cx="5268595" cy="876935"/>
+            <wp:effectExtent l="0" t="0" r="8255" b="18415"/>
+            <wp:docPr id="22" name="Picture 7"/>
             <wp:cNvGraphicFramePr>
               <a:graphicFrameLocks xmlns:a="http://schemas.openxmlformats.org/drawingml/2006/main" noChangeAspect="1"/>
             </wp:cNvGraphicFramePr>
@@ -585,7 +552,7 @@
               <a:graphicData uri="http://schemas.openxmlformats.org/drawingml/2006/picture">
                 <pic:pic xmlns:pic="http://schemas.openxmlformats.org/drawingml/2006/picture">
                   <pic:nvPicPr>
-                    <pic:cNvPr id="7" name="Picture 7"/>
+                    <pic:cNvPr id="22" name="Picture 7"/>
                     <pic:cNvPicPr>
                       <a:picLocks noChangeAspect="1"/>
                     </pic:cNvPicPr>
@@ -599,7 +566,7 @@
                   <pic:spPr>
                     <a:xfrm>
                       <a:off x="0" y="0"/>
-                      <a:ext cx="5262880" cy="3072130"/>
+                      <a:ext cx="5268595" cy="876935"/>
                     </a:xfrm>
                     <a:prstGeom prst="rect">
                       <a:avLst/>
@@ -632,7 +599,7 @@
           <w:rFonts w:hint="default"/>
           <w:lang w:val="vi-VN"/>
         </w:rPr>
-        <w:t>H/</w:t>
+        <w:t>C/</w:t>
       </w:r>
     </w:p>
     <w:p>
@@ -649,9 +616,9 @@
       <w:r>
         <w:drawing>
           <wp:inline distT="0" distB="0" distL="114300" distR="114300">
-            <wp:extent cx="5265420" cy="2625090"/>
-            <wp:effectExtent l="0" t="0" r="11430" b="3810"/>
-            <wp:docPr id="8" name="Picture 8"/>
+            <wp:extent cx="5273675" cy="1680845"/>
+            <wp:effectExtent l="0" t="0" r="3175" b="14605"/>
+            <wp:docPr id="23" name="Picture 8"/>
             <wp:cNvGraphicFramePr>
               <a:graphicFrameLocks xmlns:a="http://schemas.openxmlformats.org/drawingml/2006/main" noChangeAspect="1"/>
             </wp:cNvGraphicFramePr>
@@ -659,7 +626,7 @@
               <a:graphicData uri="http://schemas.openxmlformats.org/drawingml/2006/picture">
                 <pic:pic xmlns:pic="http://schemas.openxmlformats.org/drawingml/2006/picture">
                   <pic:nvPicPr>
-                    <pic:cNvPr id="8" name="Picture 8"/>
+                    <pic:cNvPr id="23" name="Picture 8"/>
                     <pic:cNvPicPr>
                       <a:picLocks noChangeAspect="1"/>
                     </pic:cNvPicPr>
@@ -673,7 +640,7 @@
                   <pic:spPr>
                     <a:xfrm>
                       <a:off x="0" y="0"/>
-                      <a:ext cx="5265420" cy="2625090"/>
+                      <a:ext cx="5273675" cy="1680845"/>
                     </a:xfrm>
                     <a:prstGeom prst="rect">
                       <a:avLst/>
@@ -701,43 +668,12 @@
           <w:lang w:val="vi-VN"/>
         </w:rPr>
       </w:pPr>
-    </w:p>
-    <w:p>
-      <w:pPr>
-        <w:numPr>
-          <w:ilvl w:val="0"/>
-          <w:numId w:val="0"/>
-        </w:numPr>
-        <w:rPr>
-          <w:rFonts w:hint="default"/>
-          <w:lang w:val="vi-VN"/>
-        </w:rPr>
-      </w:pPr>
-      <w:r>
-        <w:rPr>
-          <w:rFonts w:hint="default"/>
-          <w:lang w:val="vi-VN"/>
-        </w:rPr>
-        <w:t xml:space="preserve">Bài 2 </w:t>
-      </w:r>
-    </w:p>
-    <w:p>
-      <w:pPr>
-        <w:numPr>
-          <w:ilvl w:val="0"/>
-          <w:numId w:val="0"/>
-        </w:numPr>
-        <w:rPr>
-          <w:rFonts w:hint="default"/>
-          <w:lang w:val="vi-VN"/>
-        </w:rPr>
-      </w:pPr>
-      <w:r>
-        <w:rPr>
-          <w:rFonts w:hint="default"/>
-          <w:lang w:val="vi-VN"/>
-        </w:rPr>
-        <w:t>A/</w:t>
+      <w:r>
+        <w:rPr>
+          <w:rFonts w:hint="default"/>
+          <w:lang w:val="vi-VN"/>
+        </w:rPr>
+        <w:t>D/</w:t>
       </w:r>
     </w:p>
     <w:p>
@@ -754,9 +690,9 @@
       <w:r>
         <w:drawing>
           <wp:inline distT="0" distB="0" distL="114300" distR="114300">
-            <wp:extent cx="5273040" cy="3529330"/>
-            <wp:effectExtent l="0" t="0" r="3810" b="13970"/>
-            <wp:docPr id="9" name="Picture 9"/>
+            <wp:extent cx="5269230" cy="970280"/>
+            <wp:effectExtent l="0" t="0" r="7620" b="1270"/>
+            <wp:docPr id="24" name="Picture 9"/>
             <wp:cNvGraphicFramePr>
               <a:graphicFrameLocks xmlns:a="http://schemas.openxmlformats.org/drawingml/2006/main" noChangeAspect="1"/>
             </wp:cNvGraphicFramePr>
@@ -764,7 +700,7 @@
               <a:graphicData uri="http://schemas.openxmlformats.org/drawingml/2006/picture">
                 <pic:pic xmlns:pic="http://schemas.openxmlformats.org/drawingml/2006/picture">
                   <pic:nvPicPr>
-                    <pic:cNvPr id="9" name="Picture 9"/>
+                    <pic:cNvPr id="24" name="Picture 9"/>
                     <pic:cNvPicPr>
                       <a:picLocks noChangeAspect="1"/>
                     </pic:cNvPicPr>
@@ -778,7 +714,7 @@
                   <pic:spPr>
                     <a:xfrm>
                       <a:off x="0" y="0"/>
-                      <a:ext cx="5273040" cy="3529330"/>
+                      <a:ext cx="5269230" cy="970280"/>
                     </a:xfrm>
                     <a:prstGeom prst="rect">
                       <a:avLst/>
@@ -811,7 +747,7 @@
           <w:rFonts w:hint="default"/>
           <w:lang w:val="vi-VN"/>
         </w:rPr>
-        <w:t>B/</w:t>
+        <w:t>E/</w:t>
       </w:r>
     </w:p>
     <w:p>
@@ -828,9 +764,9 @@
       <w:r>
         <w:drawing>
           <wp:inline distT="0" distB="0" distL="114300" distR="114300">
-            <wp:extent cx="635" cy="0"/>
-            <wp:effectExtent l="0" t="0" r="0" b="0"/>
-            <wp:docPr id="10" name="Picture 10"/>
+            <wp:extent cx="5272405" cy="2837815"/>
+            <wp:effectExtent l="0" t="0" r="4445" b="635"/>
+            <wp:docPr id="25" name="Picture 10"/>
             <wp:cNvGraphicFramePr>
               <a:graphicFrameLocks xmlns:a="http://schemas.openxmlformats.org/drawingml/2006/main" noChangeAspect="1"/>
             </wp:cNvGraphicFramePr>
@@ -838,7 +774,7 @@
               <a:graphicData uri="http://schemas.openxmlformats.org/drawingml/2006/picture">
                 <pic:pic xmlns:pic="http://schemas.openxmlformats.org/drawingml/2006/picture">
                   <pic:nvPicPr>
-                    <pic:cNvPr id="10" name="Picture 10"/>
+                    <pic:cNvPr id="25" name="Picture 10"/>
                     <pic:cNvPicPr>
                       <a:picLocks noChangeAspect="1"/>
                     </pic:cNvPicPr>
@@ -852,7 +788,7 @@
                   <pic:spPr>
                     <a:xfrm>
                       <a:off x="0" y="0"/>
-                      <a:ext cx="635" cy="0"/>
+                      <a:ext cx="5272405" cy="2837815"/>
                     </a:xfrm>
                     <a:prstGeom prst="rect">
                       <a:avLst/>
@@ -868,12 +804,43 @@
           </wp:inline>
         </w:drawing>
       </w:r>
+    </w:p>
+    <w:p>
+      <w:pPr>
+        <w:numPr>
+          <w:ilvl w:val="0"/>
+          <w:numId w:val="0"/>
+        </w:numPr>
+        <w:rPr>
+          <w:rFonts w:hint="default"/>
+          <w:lang w:val="vi-VN"/>
+        </w:rPr>
+      </w:pPr>
+      <w:r>
+        <w:rPr>
+          <w:rFonts w:hint="default"/>
+          <w:lang w:val="vi-VN"/>
+        </w:rPr>
+        <w:t>F/</w:t>
+      </w:r>
+    </w:p>
+    <w:p>
+      <w:pPr>
+        <w:numPr>
+          <w:ilvl w:val="0"/>
+          <w:numId w:val="0"/>
+        </w:numPr>
+        <w:rPr>
+          <w:rFonts w:hint="default"/>
+          <w:lang w:val="vi-VN"/>
+        </w:rPr>
+      </w:pPr>
       <w:r>
         <w:drawing>
           <wp:inline distT="0" distB="0" distL="114300" distR="114300">
-            <wp:extent cx="5266055" cy="3317875"/>
-            <wp:effectExtent l="0" t="0" r="10795" b="15875"/>
-            <wp:docPr id="11" name="Picture 11"/>
+            <wp:extent cx="5269230" cy="2318385"/>
+            <wp:effectExtent l="0" t="0" r="7620" b="5715"/>
+            <wp:docPr id="26" name="Picture 11"/>
             <wp:cNvGraphicFramePr>
               <a:graphicFrameLocks xmlns:a="http://schemas.openxmlformats.org/drawingml/2006/main" noChangeAspect="1"/>
             </wp:cNvGraphicFramePr>
@@ -881,7 +848,7 @@
               <a:graphicData uri="http://schemas.openxmlformats.org/drawingml/2006/picture">
                 <pic:pic xmlns:pic="http://schemas.openxmlformats.org/drawingml/2006/picture">
                   <pic:nvPicPr>
-                    <pic:cNvPr id="11" name="Picture 11"/>
+                    <pic:cNvPr id="26" name="Picture 11"/>
                     <pic:cNvPicPr>
                       <a:picLocks noChangeAspect="1"/>
                     </pic:cNvPicPr>
@@ -895,7 +862,7 @@
                   <pic:spPr>
                     <a:xfrm>
                       <a:off x="0" y="0"/>
-                      <a:ext cx="5266055" cy="3317875"/>
+                      <a:ext cx="5269230" cy="2318385"/>
                     </a:xfrm>
                     <a:prstGeom prst="rect">
                       <a:avLst/>
@@ -928,26 +895,14 @@
           <w:rFonts w:hint="default"/>
           <w:lang w:val="vi-VN"/>
         </w:rPr>
-        <w:t>C/</w:t>
-      </w:r>
-    </w:p>
-    <w:p>
-      <w:pPr>
-        <w:numPr>
-          <w:ilvl w:val="0"/>
-          <w:numId w:val="0"/>
-        </w:numPr>
-        <w:rPr>
-          <w:rFonts w:hint="default"/>
-          <w:lang w:val="vi-VN"/>
-        </w:rPr>
-      </w:pPr>
+        <w:t>G/</w:t>
+      </w:r>
       <w:r>
         <w:drawing>
           <wp:inline distT="0" distB="0" distL="114300" distR="114300">
-            <wp:extent cx="5270500" cy="3662680"/>
-            <wp:effectExtent l="0" t="0" r="6350" b="13970"/>
-            <wp:docPr id="12" name="Picture 12"/>
+            <wp:extent cx="5273040" cy="2129155"/>
+            <wp:effectExtent l="0" t="0" r="3810" b="4445"/>
+            <wp:docPr id="27" name="Picture 12"/>
             <wp:cNvGraphicFramePr>
               <a:graphicFrameLocks xmlns:a="http://schemas.openxmlformats.org/drawingml/2006/main" noChangeAspect="1"/>
             </wp:cNvGraphicFramePr>
@@ -955,7 +910,7 @@
               <a:graphicData uri="http://schemas.openxmlformats.org/drawingml/2006/picture">
                 <pic:pic xmlns:pic="http://schemas.openxmlformats.org/drawingml/2006/picture">
                   <pic:nvPicPr>
-                    <pic:cNvPr id="12" name="Picture 12"/>
+                    <pic:cNvPr id="27" name="Picture 12"/>
                     <pic:cNvPicPr>
                       <a:picLocks noChangeAspect="1"/>
                     </pic:cNvPicPr>
@@ -969,7 +924,7 @@
                   <pic:spPr>
                     <a:xfrm>
                       <a:off x="0" y="0"/>
-                      <a:ext cx="5270500" cy="3662680"/>
+                      <a:ext cx="5273040" cy="2129155"/>
                     </a:xfrm>
                     <a:prstGeom prst="rect">
                       <a:avLst/>
@@ -1002,324 +957,235 @@
           <w:rFonts w:hint="default"/>
           <w:lang w:val="vi-VN"/>
         </w:rPr>
-        <w:t>D/</w:t>
-      </w:r>
-    </w:p>
-    <w:p>
-      <w:pPr>
-        <w:numPr>
-          <w:ilvl w:val="0"/>
-          <w:numId w:val="0"/>
-        </w:numPr>
-        <w:rPr>
-          <w:rFonts w:hint="default"/>
-          <w:lang w:val="vi-VN"/>
-        </w:rPr>
-      </w:pPr>
-      <w:r>
-        <w:drawing>
-          <wp:inline distT="0" distB="0" distL="114300" distR="114300">
-            <wp:extent cx="5271135" cy="3137535"/>
-            <wp:effectExtent l="0" t="0" r="5715" b="5715"/>
-            <wp:docPr id="13" name="Picture 13"/>
-            <wp:cNvGraphicFramePr>
-              <a:graphicFrameLocks xmlns:a="http://schemas.openxmlformats.org/drawingml/2006/main" noChangeAspect="1"/>
-            </wp:cNvGraphicFramePr>
-            <a:graphic xmlns:a="http://schemas.openxmlformats.org/drawingml/2006/main">
-              <a:graphicData uri="http://schemas.openxmlformats.org/drawingml/2006/picture">
-                <pic:pic xmlns:pic="http://schemas.openxmlformats.org/drawingml/2006/picture">
-                  <pic:nvPicPr>
-                    <pic:cNvPr id="13" name="Picture 13"/>
-                    <pic:cNvPicPr>
-                      <a:picLocks noChangeAspect="1"/>
-                    </pic:cNvPicPr>
-                  </pic:nvPicPr>
-                  <pic:blipFill>
-                    <a:blip r:embed="rId16"/>
-                    <a:stretch>
-                      <a:fillRect/>
-                    </a:stretch>
-                  </pic:blipFill>
-                  <pic:spPr>
-                    <a:xfrm>
-                      <a:off x="0" y="0"/>
-                      <a:ext cx="5271135" cy="3137535"/>
-                    </a:xfrm>
-                    <a:prstGeom prst="rect">
-                      <a:avLst/>
-                    </a:prstGeom>
-                    <a:noFill/>
-                    <a:ln>
-                      <a:noFill/>
-                    </a:ln>
-                  </pic:spPr>
-                </pic:pic>
-              </a:graphicData>
-            </a:graphic>
-          </wp:inline>
-        </w:drawing>
-      </w:r>
-    </w:p>
-    <w:p>
-      <w:pPr>
-        <w:numPr>
-          <w:ilvl w:val="0"/>
-          <w:numId w:val="0"/>
-        </w:numPr>
-        <w:rPr>
-          <w:rFonts w:hint="default"/>
-          <w:lang w:val="vi-VN"/>
-        </w:rPr>
-      </w:pPr>
-      <w:r>
-        <w:rPr>
-          <w:rFonts w:hint="default"/>
-          <w:lang w:val="vi-VN"/>
-        </w:rPr>
-        <w:t>E/</w:t>
-      </w:r>
-    </w:p>
-    <w:p>
-      <w:pPr>
-        <w:numPr>
-          <w:ilvl w:val="0"/>
-          <w:numId w:val="0"/>
-        </w:numPr>
-        <w:rPr>
-          <w:rFonts w:hint="default"/>
-          <w:lang w:val="vi-VN"/>
-        </w:rPr>
-      </w:pPr>
-      <w:r>
-        <w:drawing>
-          <wp:inline distT="0" distB="0" distL="114300" distR="114300">
-            <wp:extent cx="5269230" cy="3789680"/>
-            <wp:effectExtent l="0" t="0" r="7620" b="1270"/>
-            <wp:docPr id="14" name="Picture 14"/>
-            <wp:cNvGraphicFramePr>
-              <a:graphicFrameLocks xmlns:a="http://schemas.openxmlformats.org/drawingml/2006/main" noChangeAspect="1"/>
-            </wp:cNvGraphicFramePr>
-            <a:graphic xmlns:a="http://schemas.openxmlformats.org/drawingml/2006/main">
-              <a:graphicData uri="http://schemas.openxmlformats.org/drawingml/2006/picture">
-                <pic:pic xmlns:pic="http://schemas.openxmlformats.org/drawingml/2006/picture">
-                  <pic:nvPicPr>
-                    <pic:cNvPr id="14" name="Picture 14"/>
-                    <pic:cNvPicPr>
-                      <a:picLocks noChangeAspect="1"/>
-                    </pic:cNvPicPr>
-                  </pic:nvPicPr>
-                  <pic:blipFill>
-                    <a:blip r:embed="rId17"/>
-                    <a:stretch>
-                      <a:fillRect/>
-                    </a:stretch>
-                  </pic:blipFill>
-                  <pic:spPr>
-                    <a:xfrm>
-                      <a:off x="0" y="0"/>
-                      <a:ext cx="5269230" cy="3789680"/>
-                    </a:xfrm>
-                    <a:prstGeom prst="rect">
-                      <a:avLst/>
-                    </a:prstGeom>
-                    <a:noFill/>
-                    <a:ln>
-                      <a:noFill/>
-                    </a:ln>
-                  </pic:spPr>
-                </pic:pic>
-              </a:graphicData>
-            </a:graphic>
-          </wp:inline>
-        </w:drawing>
-      </w:r>
-    </w:p>
-    <w:p>
-      <w:pPr>
-        <w:numPr>
-          <w:ilvl w:val="0"/>
-          <w:numId w:val="0"/>
-        </w:numPr>
-        <w:rPr>
-          <w:rFonts w:hint="default"/>
-          <w:lang w:val="vi-VN"/>
-        </w:rPr>
-      </w:pPr>
-      <w:r>
-        <w:rPr>
-          <w:rFonts w:hint="default"/>
-          <w:lang w:val="vi-VN"/>
-        </w:rPr>
-        <w:t>F/</w:t>
-      </w:r>
-    </w:p>
-    <w:p>
-      <w:pPr>
-        <w:numPr>
-          <w:ilvl w:val="0"/>
-          <w:numId w:val="0"/>
-        </w:numPr>
-        <w:rPr>
-          <w:rFonts w:hint="default"/>
-          <w:lang w:val="vi-VN"/>
-        </w:rPr>
-      </w:pPr>
-      <w:r>
-        <w:drawing>
-          <wp:inline distT="0" distB="0" distL="114300" distR="114300">
-            <wp:extent cx="5274310" cy="3272790"/>
-            <wp:effectExtent l="0" t="0" r="2540" b="3810"/>
-            <wp:docPr id="15" name="Picture 15"/>
-            <wp:cNvGraphicFramePr>
-              <a:graphicFrameLocks xmlns:a="http://schemas.openxmlformats.org/drawingml/2006/main" noChangeAspect="1"/>
-            </wp:cNvGraphicFramePr>
-            <a:graphic xmlns:a="http://schemas.openxmlformats.org/drawingml/2006/main">
-              <a:graphicData uri="http://schemas.openxmlformats.org/drawingml/2006/picture">
-                <pic:pic xmlns:pic="http://schemas.openxmlformats.org/drawingml/2006/picture">
-                  <pic:nvPicPr>
-                    <pic:cNvPr id="15" name="Picture 15"/>
-                    <pic:cNvPicPr>
-                      <a:picLocks noChangeAspect="1"/>
-                    </pic:cNvPicPr>
-                  </pic:nvPicPr>
-                  <pic:blipFill>
-                    <a:blip r:embed="rId18"/>
-                    <a:stretch>
-                      <a:fillRect/>
-                    </a:stretch>
-                  </pic:blipFill>
-                  <pic:spPr>
-                    <a:xfrm>
-                      <a:off x="0" y="0"/>
-                      <a:ext cx="5274310" cy="3272790"/>
-                    </a:xfrm>
-                    <a:prstGeom prst="rect">
-                      <a:avLst/>
-                    </a:prstGeom>
-                    <a:noFill/>
-                    <a:ln>
-                      <a:noFill/>
-                    </a:ln>
-                  </pic:spPr>
-                </pic:pic>
-              </a:graphicData>
-            </a:graphic>
-          </wp:inline>
-        </w:drawing>
-      </w:r>
-    </w:p>
-    <w:p>
-      <w:pPr>
-        <w:numPr>
-          <w:ilvl w:val="0"/>
-          <w:numId w:val="0"/>
-        </w:numPr>
-        <w:rPr>
-          <w:rFonts w:hint="default"/>
-          <w:lang w:val="vi-VN"/>
-        </w:rPr>
-      </w:pPr>
-      <w:r>
-        <w:rPr>
-          <w:rFonts w:hint="default"/>
-          <w:lang w:val="vi-VN"/>
-        </w:rPr>
-        <w:t>G/</w:t>
-      </w:r>
-    </w:p>
-    <w:p>
-      <w:pPr>
-        <w:numPr>
-          <w:ilvl w:val="0"/>
-          <w:numId w:val="0"/>
-        </w:numPr>
-        <w:rPr>
-          <w:rFonts w:hint="default"/>
-          <w:lang w:val="vi-VN"/>
-        </w:rPr>
-      </w:pPr>
-    </w:p>
-    <w:p>
-      <w:pPr>
-        <w:numPr>
-          <w:ilvl w:val="0"/>
-          <w:numId w:val="0"/>
-        </w:numPr>
-        <w:rPr>
-          <w:rFonts w:hint="default"/>
-          <w:lang w:val="vi-VN"/>
-        </w:rPr>
-      </w:pPr>
-    </w:p>
-    <w:p>
-      <w:pPr>
-        <w:numPr>
-          <w:ilvl w:val="0"/>
-          <w:numId w:val="0"/>
-        </w:numPr>
-        <w:rPr>
-          <w:rFonts w:hint="default"/>
-          <w:lang w:val="vi-VN"/>
-        </w:rPr>
-      </w:pPr>
-      <w:r>
-        <w:drawing>
-          <wp:inline distT="0" distB="0" distL="114300" distR="114300">
-            <wp:extent cx="5273675" cy="3044190"/>
-            <wp:effectExtent l="0" t="0" r="3175" b="3810"/>
-            <wp:docPr id="16" name="Picture 16"/>
-            <wp:cNvGraphicFramePr>
-              <a:graphicFrameLocks xmlns:a="http://schemas.openxmlformats.org/drawingml/2006/main" noChangeAspect="1"/>
-            </wp:cNvGraphicFramePr>
-            <a:graphic xmlns:a="http://schemas.openxmlformats.org/drawingml/2006/main">
-              <a:graphicData uri="http://schemas.openxmlformats.org/drawingml/2006/picture">
-                <pic:pic xmlns:pic="http://schemas.openxmlformats.org/drawingml/2006/picture">
-                  <pic:nvPicPr>
-                    <pic:cNvPr id="16" name="Picture 16"/>
-                    <pic:cNvPicPr>
-                      <a:picLocks noChangeAspect="1"/>
-                    </pic:cNvPicPr>
-                  </pic:nvPicPr>
-                  <pic:blipFill>
-                    <a:blip r:embed="rId19"/>
-                    <a:stretch>
-                      <a:fillRect/>
-                    </a:stretch>
-                  </pic:blipFill>
-                  <pic:spPr>
-                    <a:xfrm>
-                      <a:off x="0" y="0"/>
-                      <a:ext cx="5273675" cy="3044190"/>
-                    </a:xfrm>
-                    <a:prstGeom prst="rect">
-                      <a:avLst/>
-                    </a:prstGeom>
-                    <a:noFill/>
-                    <a:ln>
-                      <a:noFill/>
-                    </a:ln>
-                  </pic:spPr>
-                </pic:pic>
-              </a:graphicData>
-            </a:graphic>
-          </wp:inline>
-        </w:drawing>
-      </w:r>
+        <w:t>H/</w:t>
+      </w:r>
+    </w:p>
+    <w:p>
+      <w:pPr>
+        <w:numPr>
+          <w:ilvl w:val="0"/>
+          <w:numId w:val="0"/>
+        </w:numPr>
+        <w:rPr>
+          <w:rFonts w:hint="default"/>
+          <w:lang w:val="vi-VN"/>
+        </w:rPr>
+      </w:pPr>
+    </w:p>
+    <w:p>
+      <w:pPr>
+        <w:numPr>
+          <w:ilvl w:val="0"/>
+          <w:numId w:val="0"/>
+        </w:numPr>
+      </w:pPr>
+    </w:p>
+    <w:p>
+      <w:pPr>
+        <w:numPr>
+          <w:ilvl w:val="0"/>
+          <w:numId w:val="0"/>
+        </w:numPr>
+      </w:pPr>
+    </w:p>
+    <w:p>
+      <w:pPr>
+        <w:numPr>
+          <w:ilvl w:val="0"/>
+          <w:numId w:val="0"/>
+        </w:numPr>
+      </w:pPr>
+    </w:p>
+    <w:p>
+      <w:pPr>
+        <w:numPr>
+          <w:ilvl w:val="0"/>
+          <w:numId w:val="0"/>
+        </w:numPr>
+      </w:pPr>
+    </w:p>
+    <w:p>
+      <w:pPr>
+        <w:numPr>
+          <w:ilvl w:val="0"/>
+          <w:numId w:val="0"/>
+        </w:numPr>
+      </w:pPr>
+    </w:p>
+    <w:p>
+      <w:pPr>
+        <w:numPr>
+          <w:ilvl w:val="0"/>
+          <w:numId w:val="0"/>
+        </w:numPr>
+      </w:pPr>
+    </w:p>
+    <w:p>
+      <w:pPr>
+        <w:numPr>
+          <w:ilvl w:val="0"/>
+          <w:numId w:val="0"/>
+        </w:numPr>
+      </w:pPr>
+    </w:p>
+    <w:p>
+      <w:pPr>
+        <w:numPr>
+          <w:ilvl w:val="0"/>
+          <w:numId w:val="0"/>
+        </w:numPr>
+      </w:pPr>
+    </w:p>
+    <w:p>
+      <w:pPr>
+        <w:numPr>
+          <w:ilvl w:val="0"/>
+          <w:numId w:val="0"/>
+        </w:numPr>
+      </w:pPr>
+    </w:p>
+    <w:p>
+      <w:pPr>
+        <w:numPr>
+          <w:ilvl w:val="0"/>
+          <w:numId w:val="0"/>
+        </w:numPr>
+      </w:pPr>
+    </w:p>
+    <w:p>
+      <w:pPr>
+        <w:numPr>
+          <w:ilvl w:val="0"/>
+          <w:numId w:val="0"/>
+        </w:numPr>
+      </w:pPr>
+    </w:p>
+    <w:p>
+      <w:pPr>
+        <w:numPr>
+          <w:ilvl w:val="0"/>
+          <w:numId w:val="0"/>
+        </w:numPr>
+      </w:pPr>
+    </w:p>
+    <w:p>
+      <w:pPr>
+        <w:numPr>
+          <w:ilvl w:val="0"/>
+          <w:numId w:val="0"/>
+        </w:numPr>
+      </w:pPr>
+    </w:p>
+    <w:p>
+      <w:pPr>
+        <w:numPr>
+          <w:ilvl w:val="0"/>
+          <w:numId w:val="0"/>
+        </w:numPr>
+      </w:pPr>
+    </w:p>
+    <w:p>
+      <w:pPr>
+        <w:numPr>
+          <w:ilvl w:val="0"/>
+          <w:numId w:val="0"/>
+        </w:numPr>
+      </w:pPr>
+    </w:p>
+    <w:p>
+      <w:pPr>
+        <w:numPr>
+          <w:ilvl w:val="0"/>
+          <w:numId w:val="0"/>
+        </w:numPr>
+      </w:pPr>
+    </w:p>
+    <w:p>
+      <w:pPr>
+        <w:numPr>
+          <w:ilvl w:val="0"/>
+          <w:numId w:val="0"/>
+        </w:numPr>
+      </w:pPr>
+    </w:p>
+    <w:p>
+      <w:pPr>
+        <w:numPr>
+          <w:ilvl w:val="0"/>
+          <w:numId w:val="0"/>
+        </w:numPr>
+      </w:pPr>
+    </w:p>
+    <w:p>
+      <w:pPr>
+        <w:numPr>
+          <w:ilvl w:val="0"/>
+          <w:numId w:val="0"/>
+        </w:numPr>
+      </w:pPr>
+    </w:p>
+    <w:p>
+      <w:pPr>
+        <w:numPr>
+          <w:ilvl w:val="0"/>
+          <w:numId w:val="0"/>
+        </w:numPr>
+      </w:pPr>
+    </w:p>
+    <w:p>
+      <w:pPr>
+        <w:numPr>
+          <w:ilvl w:val="0"/>
+          <w:numId w:val="0"/>
+        </w:numPr>
+      </w:pPr>
+    </w:p>
+    <w:p>
+      <w:pPr>
+        <w:numPr>
+          <w:ilvl w:val="0"/>
+          <w:numId w:val="0"/>
+        </w:numPr>
+      </w:pPr>
+    </w:p>
+    <w:p>
+      <w:pPr>
+        <w:numPr>
+          <w:ilvl w:val="0"/>
+          <w:numId w:val="0"/>
+        </w:numPr>
+      </w:pPr>
+    </w:p>
+    <w:p>
+      <w:pPr>
+        <w:numPr>
+          <w:ilvl w:val="0"/>
+          <w:numId w:val="0"/>
+        </w:numPr>
+      </w:pPr>
+    </w:p>
+    <w:p>
+      <w:pPr>
+        <w:numPr>
+          <w:ilvl w:val="0"/>
+          <w:numId w:val="0"/>
+        </w:numPr>
+      </w:pPr>
+    </w:p>
+    <w:p>
+      <w:pPr>
+        <w:numPr>
+          <w:ilvl w:val="0"/>
+          <w:numId w:val="0"/>
+        </w:numPr>
+        <w:rPr>
+          <w:rFonts w:hint="default"/>
+          <w:lang w:val="vi-VN"/>
+        </w:rPr>
+      </w:pPr>
       <w:bookmarkStart w:id="0" w:name="_GoBack"/>
-      <w:bookmarkEnd w:id="0"/>
-    </w:p>
-    <w:p>
-      <w:pPr>
-        <w:numPr>
-          <w:ilvl w:val="0"/>
-          <w:numId w:val="0"/>
-        </w:numPr>
-        <w:rPr>
-          <w:rFonts w:hint="default"/>
-          <w:lang w:val="vi-VN"/>
-        </w:rPr>
-      </w:pPr>
-    </w:p>
+    </w:p>
+    <w:bookmarkEnd w:id="0"/>
     <w:sectPr>
       <w:pgSz w:w="11906" w:h="16838"/>
       <w:pgMar w:top="1440" w:right="1800" w:bottom="1440" w:left="1800" w:header="720" w:footer="720" w:gutter="0"/>

</xml_diff>